<commit_message>
Clarify final-test and publication status
</commit_message>
<xml_diff>
--- a/Report_Draft/MMA3001_suspension_report_draft.docx
+++ b/Report_Draft/MMA3001_suspension_report_draft.docx
@@ -92,7 +92,7 @@
         <w:spacing w:after="80" w:line="250" w:lineRule="auto"/>
       </w:pPr>
       <w:r>
-        <w:t>The passive linear quarter-car model fixes both masses, tyre stiffness and bump while varying stiffness and damping. No measured-car calibration or comfort, grip, safety or lap-time claim is made. Scientific evidence is published at checkpoint 8ba9808 (11 October); Section 7 separately labels the 12 October local profiling supplement, whose upload is unverified. [E1, E6, E7]</w:t>
+        <w:t>The passive linear quarter-car model fixes both masses, tyre stiffness and bump while varying stiffness and damping. No measured-car calibration or comfort, grip, safety or lap-time claim is made. Scientific outputs E1 to E6 were published in checkpoint 8ba9808 (11 October). The 12 October profiling supplement in Section 7 was published in checkpoint 1385cf6 (25 October). [E1, E6, E7]</w:t>
       </w:r>
     </w:p>
     <w:p>
@@ -3730,12 +3730,12 @@
         <w:pStyle w:val="Heading2"/>
       </w:pPr>
       <w:r>
-        <w:t>Later local profiling supplement</w:t>
+        <w:t>Nominal profiling supplement</w:t>
       </w:r>
     </w:p>
     <w:p>
       <w:r>
-        <w:t>A 12 October local study, later than the verified 11 October published checkpoint, profiled the unchanged full diagnostic nominal calculation. One warmup and three alternating unprofiled and profiled pairs produced seven solves. All non timing summary fields exactly matched the saved baseline, five study checks passed and 13 focused bookkeeping tests passed. The earlier full 433 test suite was not rerun. [E7]</w:t>
+        <w:t>On 12 October, a separate study profiled the unchanged full diagnostic nominal calculation. One warmup and three alternating unprofiled and profiled pairs produced seven solves. All non timing summary fields exactly matched the saved baseline, five study checks passed and 13 focused bookkeeping tests passed. The earlier full 433 test suite was not rerun. [E7]</w:t>
       </w:r>
     </w:p>
     <w:p>
@@ -4063,7 +4063,7 @@
         <w:rPr>
           <w:sz w:val="19"/>
         </w:rPr>
-        <w:t>E1 to E7 paths are relative to Suspension_Model. After a comma, a bare filename inherits the preceding folder. Scientific outputs E1 to E6 are in checkpoint 8ba9808f10dcdc84330135870d8b7f92c189f0a8. E7 is local. E8 and E9 include later records whose dates distinguish publication from local work.</w:t>
+        <w:t>E1 to E7 paths are relative to Suspension_Model. After a comma, a bare filename inherits the preceding folder. Scientific outputs E1 to E6 were present in checkpoint 8ba9808f10dcdc84330135870d8b7f92c189f0a8. The E7 profiling supplement was published in checkpoint 1385cf6 on 25 October. E8 and E9 retain dated reproduction, review and AI-use records.</w:t>
       </w:r>
     </w:p>
     <w:p>
@@ -4140,7 +4140,7 @@
         <w:rPr>
           <w:sz w:val="19"/>
         </w:rPr>
-        <w:t>[E7] PROFILING_GUIDE.md; profiling_v1/CHECK_RESULTS.md, TEST_RESULTS.md. Local 12 October supplement, not verified as uploaded.</w:t>
+        <w:t>[E7] PROFILING_GUIDE.md; profiling_v1/CHECK_RESULTS.md, TEST_RESULTS.md. The 12 October profiling study, published in checkpoint 1385cf6 on 25 October.</w:t>
       </w:r>
     </w:p>
     <w:p>
@@ -4174,7 +4174,7 @@
           <w:rPr>
             <w:color w:val="174D72"/>
           </w:rPr>
-          <w:t>Private project repository</w:t>
+          <w:t>Project repository</w:t>
         </w:r>
       </w:hyperlink>
     </w:p>

</xml_diff>

<commit_message>
Correct final figure caption and review submission
</commit_message>
<xml_diff>
--- a/Report_Draft/MMA3001_suspension_report_draft.docx
+++ b/Report_Draft/MMA3001_suspension_report_draft.docx
@@ -2987,7 +2987,7 @@
         <w:pStyle w:val="Caption"/>
       </w:pPr>
       <w:r>
-        <w:t>Figure 2  Saved 1 ms trace. Left shows the first 2.5 s of the 5 s response; right enlarges the ±1 mm band and clips earlier peaks. Source E1.</w:t>
+        <w:t>Figure 2  Saved 1 ms trace. Left shows the first 2.5 s of the refined 10 s response; right enlarges the ±1 mm band and clips earlier peaks. Source E1.</w:t>
       </w:r>
     </w:p>
     <w:p>
@@ -3804,7 +3804,7 @@
     </w:p>
     <w:p>
       <w:r>
-        <w:t>Future work could refine selected sensitivity locations, measure physical vehicle responses, introduce relevant nonlinearities, and test portability in a clean environment. A future scalar road height optimisation would need an equivalent workload and preserved output checks. If any model or setting is chosen using the consumed test results, genuinely new independent cases are needed for a new generalisation claim. No further experiment is implied by this draft.</w:t>
+        <w:t>Future work could refine selected sensitivity locations, measure physical vehicle responses, introduce relevant nonlinearities, and test portability in a clean environment. A future scalar road height optimisation would need an equivalent workload and preserved output checks. If any model or setting is chosen using the consumed test results, genuinely new independent cases are needed for a new generalisation claim. No further experiment is implied by this report.</w:t>
       </w:r>
     </w:p>
     <w:p>

</xml_diff>